<commit_message>
remove fromDate, change toDate to ConsDate, add IsConsolidated field
</commit_message>
<xml_diff>
--- a/Layout/ConsInvoiceSGSListWord.docx
+++ b/Layout/ConsInvoiceSGSListWord.docx
@@ -248,7 +248,7 @@
           <w:placeholder>
             <w:docPart w:val="DefaultPlaceholder_-1854013440"/>
           </w:placeholder>
-          <w15:dataBinding w:prefixMappings="xmlns:ns0='urn:microsoft-dynamics-nav/reports/Cons_invoice_report_SGS/50100/' " w:xpath="/ns0:NavWordReportXmlPart[1]/ns0:ConsSalesInvHeader[1]/ns0:No_ConsSalesInvHeader[1]" w:storeItemID="{4DDB2623-6F52-4CC1-8AFA-1F2BE3A6886E}" w16sdtdh:storeItemChecksum="v4mo1w=="/>
+          <w15:dataBinding w:prefixMappings="xmlns:ns0='urn:microsoft-dynamics-nav/reports/Cons_invoice_report_SGS/50100/' " w:xpath="/ns0:NavWordReportXmlPart[1]/ns0:ConsSalesInvHeader[1]/ns0:No_ConsSalesInvHeader[1]" w:storeItemID="{4DDB2623-6F52-4CC1-8AFA-1F2BE3A6886E}" w16sdtdh:storeItemChecksum="6riOjg=="/>
         </w:sdtPr>
         <w:sdtEndPr/>
         <w:sdtContent>
@@ -311,7 +311,7 @@
           <w:placeholder>
             <w:docPart w:val="DefaultPlaceholder_-1854013440"/>
           </w:placeholder>
-          <w15:dataBinding w:prefixMappings="xmlns:ns0='urn:microsoft-dynamics-nav/reports/Cons_invoice_report_SGS/50100/' " w:xpath="/ns0:NavWordReportXmlPart[1]/ns0:ConsSalesInvHeader[1]/ns0:CustNo_ConsSalesInvHeader[1]" w:storeItemID="{4DDB2623-6F52-4CC1-8AFA-1F2BE3A6886E}" w16sdtdh:storeItemChecksum="v4mo1w=="/>
+          <w15:dataBinding w:prefixMappings="xmlns:ns0='urn:microsoft-dynamics-nav/reports/Cons_invoice_report_SGS/50100/' " w:xpath="/ns0:NavWordReportXmlPart[1]/ns0:ConsSalesInvHeader[1]/ns0:CustNo_ConsSalesInvHeader[1]" w:storeItemID="{4DDB2623-6F52-4CC1-8AFA-1F2BE3A6886E}" w16sdtdh:storeItemChecksum="6riOjg=="/>
         </w:sdtPr>
         <w:sdtEndPr/>
         <w:sdtContent>
@@ -339,7 +339,21 @@
           <w:sz w:val="28"/>
           <w:szCs w:val="28"/>
         </w:rPr>
-        <w:t xml:space="preserve">From Date: </w:t>
+        <w:t>Consolidate</w:t>
+      </w:r>
+      <w:r>
+        <w:rPr>
+          <w:sz w:val="28"/>
+          <w:szCs w:val="28"/>
+        </w:rPr>
+        <w:t xml:space="preserve"> Date</w:t>
+      </w:r>
+      <w:r>
+        <w:rPr>
+          <w:sz w:val="28"/>
+          <w:szCs w:val="28"/>
+        </w:rPr>
+        <w:t xml:space="preserve">: </w:t>
       </w:r>
       <w:sdt>
         <w:sdtPr>
@@ -347,11 +361,11 @@
             <w:sz w:val="28"/>
             <w:szCs w:val="28"/>
           </w:rPr>
-          <w:id w:val="-633101579"/>
+          <w:id w:val="-1917393357"/>
           <w:placeholder>
             <w:docPart w:val="DefaultPlaceholder_-1854013440"/>
           </w:placeholder>
-          <w15:dataBinding w:prefixMappings="xmlns:ns0='urn:microsoft-dynamics-nav/reports/Cons_invoice_report_SGS/50100/' " w:xpath="/ns0:NavWordReportXmlPart[1]/ns0:ConsSalesInvHeader[1]/ns0:FromDate_ConsSalesInvHeader[1]" w:storeItemID="{4DDB2623-6F52-4CC1-8AFA-1F2BE3A6886E}" w16sdtdh:storeItemChecksum="v4mo1w=="/>
+          <w15:dataBinding w:prefixMappings="xmlns:ns0='urn:microsoft-dynamics-nav/reports/Cons_invoice_report_SGS/50100/' " w:xpath="/ns0:NavWordReportXmlPart[1]/ns0:ConsSalesInvHeader[1]/ns0:ConsDate_ConsSalesInvHeader[1]" w:storeItemID="{4DDB2623-6F52-4CC1-8AFA-1F2BE3A6886E}" w16sdtdh:storeItemChecksum="6riOjg=="/>
         </w:sdtPr>
         <w:sdtEndPr/>
         <w:sdtContent>
@@ -361,47 +375,7 @@
               <w:sz w:val="28"/>
               <w:szCs w:val="28"/>
             </w:rPr>
-            <w:t>FromDate_ConsSalesInvHeader</w:t>
-          </w:r>
-          <w:proofErr w:type="spellEnd"/>
-        </w:sdtContent>
-      </w:sdt>
-    </w:p>
-    <w:p>
-      <w:pPr>
-        <w:rPr>
-          <w:sz w:val="28"/>
-          <w:szCs w:val="28"/>
-        </w:rPr>
-      </w:pPr>
-      <w:r>
-        <w:rPr>
-          <w:sz w:val="28"/>
-          <w:szCs w:val="28"/>
-        </w:rPr>
-        <w:t xml:space="preserve">To Date: </w:t>
-      </w:r>
-      <w:sdt>
-        <w:sdtPr>
-          <w:rPr>
-            <w:sz w:val="28"/>
-            <w:szCs w:val="28"/>
-          </w:rPr>
-          <w:id w:val="1269511224"/>
-          <w:placeholder>
-            <w:docPart w:val="DefaultPlaceholder_-1854013440"/>
-          </w:placeholder>
-          <w15:dataBinding w:prefixMappings="xmlns:ns0='urn:microsoft-dynamics-nav/reports/Cons_invoice_report_SGS/50100/' " w:xpath="/ns0:NavWordReportXmlPart[1]/ns0:ConsSalesInvHeader[1]/ns0:ToDate_ConsSalesInvHeader[1]" w:storeItemID="{4DDB2623-6F52-4CC1-8AFA-1F2BE3A6886E}" w16sdtdh:storeItemChecksum="v4mo1w=="/>
-        </w:sdtPr>
-        <w:sdtEndPr/>
-        <w:sdtContent>
-          <w:proofErr w:type="spellStart"/>
-          <w:r>
-            <w:rPr>
-              <w:sz w:val="28"/>
-              <w:szCs w:val="28"/>
-            </w:rPr>
-            <w:t>ToDate_ConsSalesInvHeader</w:t>
+            <w:t>ConsDate_ConsSalesInvHeader</w:t>
           </w:r>
           <w:proofErr w:type="spellEnd"/>
         </w:sdtContent>
@@ -438,7 +412,7 @@
           <w:placeholder>
             <w:docPart w:val="DefaultPlaceholder_-1854013440"/>
           </w:placeholder>
-          <w15:dataBinding w:prefixMappings="xmlns:ns0='urn:microsoft-dynamics-nav/reports/Cons_invoice_report_SGS/50100/' " w:xpath="/ns0:NavWordReportXmlPart[1]/ns0:ConsSalesInvHeader[1]/ns0:DueDate_ConsSalesInvHeader[1]" w:storeItemID="{4DDB2623-6F52-4CC1-8AFA-1F2BE3A6886E}" w16sdtdh:storeItemChecksum="v4mo1w=="/>
+          <w15:dataBinding w:prefixMappings="xmlns:ns0='urn:microsoft-dynamics-nav/reports/Cons_invoice_report_SGS/50100/' " w:xpath="/ns0:NavWordReportXmlPart[1]/ns0:ConsSalesInvHeader[1]/ns0:DueDate_ConsSalesInvHeader[1]" w:storeItemID="{4DDB2623-6F52-4CC1-8AFA-1F2BE3A6886E}" w16sdtdh:storeItemChecksum="6riOjg=="/>
         </w:sdtPr>
         <w:sdtEndPr/>
         <w:sdtContent>
@@ -478,7 +452,7 @@
           <w:placeholder>
             <w:docPart w:val="DefaultPlaceholder_-1854013440"/>
           </w:placeholder>
-          <w15:dataBinding w:prefixMappings="xmlns:ns0='urn:microsoft-dynamics-nav/reports/Cons_invoice_report_SGS/50100/' " w:xpath="/ns0:NavWordReportXmlPart[1]/ns0:ConsSalesInvHeader[1]/ns0:Status_ConsSalesInvHeader[1]" w:storeItemID="{4DDB2623-6F52-4CC1-8AFA-1F2BE3A6886E}" w16sdtdh:storeItemChecksum="v4mo1w=="/>
+          <w15:dataBinding w:prefixMappings="xmlns:ns0='urn:microsoft-dynamics-nav/reports/Cons_invoice_report_SGS/50100/' " w:xpath="/ns0:NavWordReportXmlPart[1]/ns0:ConsSalesInvHeader[1]/ns0:Status_ConsSalesInvHeader[1]" w:storeItemID="{4DDB2623-6F52-4CC1-8AFA-1F2BE3A6886E}" w16sdtdh:storeItemChecksum="6riOjg=="/>
         </w:sdtPr>
         <w:sdtEndPr/>
         <w:sdtContent>
@@ -498,31 +472,23 @@
     <w:tbl>
       <w:tblPr>
         <w:tblStyle w:val="TableGrid"/>
-        <w:tblW w:w="10097" w:type="dxa"/>
+        <w:tblW w:w="10075" w:type="dxa"/>
         <w:tblLayout w:type="fixed"/>
         <w:tblLook w:val="04A0" w:firstRow="1" w:lastRow="0" w:firstColumn="1" w:lastColumn="0" w:noHBand="0" w:noVBand="1"/>
       </w:tblPr>
       <w:tblGrid>
-        <w:gridCol w:w="1350"/>
-        <w:gridCol w:w="2880"/>
-        <w:gridCol w:w="2250"/>
-        <w:gridCol w:w="3617"/>
+        <w:gridCol w:w="1435"/>
+        <w:gridCol w:w="2160"/>
+        <w:gridCol w:w="2160"/>
+        <w:gridCol w:w="2160"/>
+        <w:gridCol w:w="2160"/>
       </w:tblGrid>
       <w:tr>
         <w:tc>
           <w:tcPr>
-            <w:tcW w:w="1350" w:type="dxa"/>
+            <w:tcW w:w="1435" w:type="dxa"/>
           </w:tcPr>
           <w:p>
-            <w:pPr>
-              <w:jc w:val="center"/>
-              <w:rPr>
-                <w:b/>
-                <w:bCs/>
-                <w:sz w:val="28"/>
-                <w:szCs w:val="28"/>
-              </w:rPr>
-            </w:pPr>
             <w:r>
               <w:rPr>
                 <w:b/>
@@ -536,18 +502,9 @@
         </w:tc>
         <w:tc>
           <w:tcPr>
-            <w:tcW w:w="2880" w:type="dxa"/>
+            <w:tcW w:w="2160" w:type="dxa"/>
           </w:tcPr>
           <w:p>
-            <w:pPr>
-              <w:jc w:val="center"/>
-              <w:rPr>
-                <w:b/>
-                <w:bCs/>
-                <w:sz w:val="28"/>
-                <w:szCs w:val="28"/>
-              </w:rPr>
-            </w:pPr>
             <w:r>
               <w:rPr>
                 <w:b/>
@@ -561,18 +518,9 @@
         </w:tc>
         <w:tc>
           <w:tcPr>
-            <w:tcW w:w="2250" w:type="dxa"/>
+            <w:tcW w:w="2160" w:type="dxa"/>
           </w:tcPr>
           <w:p>
-            <w:pPr>
-              <w:jc w:val="center"/>
-              <w:rPr>
-                <w:b/>
-                <w:bCs/>
-                <w:sz w:val="28"/>
-                <w:szCs w:val="28"/>
-              </w:rPr>
-            </w:pPr>
             <w:r>
               <w:rPr>
                 <w:b/>
@@ -586,18 +534,25 @@
         </w:tc>
         <w:tc>
           <w:tcPr>
-            <w:tcW w:w="3617" w:type="dxa"/>
+            <w:tcW w:w="2160" w:type="dxa"/>
           </w:tcPr>
           <w:p>
-            <w:pPr>
-              <w:jc w:val="center"/>
+            <w:r>
               <w:rPr>
                 <w:b/>
                 <w:bCs/>
                 <w:sz w:val="28"/>
                 <w:szCs w:val="28"/>
               </w:rPr>
-            </w:pPr>
+              <w:t>Posting Date</w:t>
+            </w:r>
+          </w:p>
+        </w:tc>
+        <w:tc>
+          <w:tcPr>
+            <w:tcW w:w="2160" w:type="dxa"/>
+          </w:tcPr>
+          <w:p>
             <w:r>
               <w:rPr>
                 <w:b/>
@@ -614,7 +569,7 @@
         <w:sdtPr>
           <w:alias w:val="#Nav: /ConsSalesInvHeader/ConsSalesInvoiceLine"/>
           <w:tag w:val="#Nav: Cons_invoice_report_SGS/50100"/>
-          <w:id w:val="-2022928825"/>
+          <w:id w:val="-958337453"/>
           <w15:dataBinding w:prefixMappings="xmlns:ns0='urn:microsoft-dynamics-nav/reports/Cons_invoice_report_SGS/50100/'" w:xpath="/ns0:NavWordReportXmlPart[1]/ns0:ConsSalesInvHeader[1]/ns0:ConsSalesInvoiceLine" w:storeItemID="{4DDB2623-6F52-4CC1-8AFA-1F2BE3A6886E}"/>
           <w15:repeatingSection/>
         </w:sdtPr>
@@ -622,131 +577,167 @@
         <w:sdtContent>
           <w:sdt>
             <w:sdtPr>
-              <w:id w:val="1638373152"/>
+              <w:id w:val="-112288922"/>
               <w:placeholder>
-                <w:docPart w:val="DefaultPlaceholder_-1854013435"/>
+                <w:docPart w:val="53E7531E7C084F60B7505CF53CDDF908"/>
               </w:placeholder>
               <w15:repeatingSectionItem/>
             </w:sdtPr>
             <w:sdtEndPr/>
             <w:sdtContent>
               <w:tr>
-                <w:sdt>
-                  <w:sdtPr>
-                    <w:alias w:val="#Nav: /ConsSalesInvHeader/ConsSalesInvoiceLine/LineNo_ConsSalesInvoiceLine"/>
-                    <w:tag w:val="#Nav: Cons_invoice_report_SGS/50100"/>
-                    <w:id w:val="-88078338"/>
-                    <w:placeholder>
-                      <w:docPart w:val="DefaultPlaceholder_-1854013440"/>
-                    </w:placeholder>
-                    <w15:dataBinding w:prefixMappings="xmlns:ns0='urn:microsoft-dynamics-nav/reports/Cons_invoice_report_SGS/50100/' " w:xpath="/ns0:NavWordReportXmlPart[1]/ns0:ConsSalesInvHeader[1]/ns0:ConsSalesInvoiceLine[1]/ns0:LineNo_ConsSalesInvoiceLine[1]" w:storeItemID="{4DDB2623-6F52-4CC1-8AFA-1F2BE3A6886E}" w16sdtdh:storeItemChecksum="v4mo1w=="/>
-                  </w:sdtPr>
-                  <w:sdtEndPr/>
-                  <w:sdtContent>
-                    <w:tc>
-                      <w:tcPr>
-                        <w:tcW w:w="1350" w:type="dxa"/>
-                      </w:tcPr>
+                <w:tc>
+                  <w:tcPr>
+                    <w:tcW w:w="1435" w:type="dxa"/>
+                  </w:tcPr>
+                  <w:sdt>
+                    <w:sdtPr>
+                      <w:alias w:val="#Nav: /ConsSalesInvHeader/ConsSalesInvoiceLine/LineNo_ConsSalesInvoiceLine"/>
+                      <w:tag w:val="#Nav: Cons_invoice_report_SGS/50100"/>
+                      <w:id w:val="1938547789"/>
+                      <w:placeholder>
+                        <w:docPart w:val="064912470D48411B917A03DADC9CCDF0"/>
+                      </w:placeholder>
+                      <w15:dataBinding w:prefixMappings="xmlns:ns0='urn:microsoft-dynamics-nav/reports/Cons_invoice_report_SGS/50100/' " w:xpath="/ns0:NavWordReportXmlPart[1]/ns0:ConsSalesInvHeader[1]/ns0:ConsSalesInvoiceLine[1]/ns0:LineNo_ConsSalesInvoiceLine[1]" w:storeItemID="{4DDB2623-6F52-4CC1-8AFA-1F2BE3A6886E}" w16sdtdh:storeItemChecksum="6riOjg=="/>
+                    </w:sdtPr>
+                    <w:sdtEndPr/>
+                    <w:sdtContent>
                       <w:p>
-                        <w:pPr>
-                          <w:jc w:val="center"/>
-                        </w:pPr>
                         <w:proofErr w:type="spellStart"/>
                         <w:r>
                           <w:t>LineNo_ConsSalesInvoiceLine</w:t>
                         </w:r>
                         <w:proofErr w:type="spellEnd"/>
                       </w:p>
-                    </w:tc>
-                  </w:sdtContent>
-                </w:sdt>
-                <w:sdt>
-                  <w:sdtPr>
-                    <w:alias w:val="#Nav: /ConsSalesInvHeader/ConsSalesInvoiceLine/ChildInvoice_ConsSalesInvoiceLine"/>
-                    <w:tag w:val="#Nav: Cons_invoice_report_SGS/50100"/>
-                    <w:id w:val="-1104334162"/>
-                    <w:placeholder>
-                      <w:docPart w:val="DefaultPlaceholder_-1854013440"/>
-                    </w:placeholder>
-                    <w15:dataBinding w:prefixMappings="xmlns:ns0='urn:microsoft-dynamics-nav/reports/Cons_invoice_report_SGS/50100/' " w:xpath="/ns0:NavWordReportXmlPart[1]/ns0:ConsSalesInvHeader[1]/ns0:ConsSalesInvoiceLine[1]/ns0:ChildInvoice_ConsSalesInvoiceLine[1]" w:storeItemID="{4DDB2623-6F52-4CC1-8AFA-1F2BE3A6886E}" w16sdtdh:storeItemChecksum="v4mo1w=="/>
-                  </w:sdtPr>
-                  <w:sdtEndPr/>
-                  <w:sdtContent>
-                    <w:tc>
-                      <w:tcPr>
-                        <w:tcW w:w="2880" w:type="dxa"/>
-                      </w:tcPr>
+                    </w:sdtContent>
+                  </w:sdt>
+                  <w:p/>
+                </w:tc>
+                <w:tc>
+                  <w:tcPr>
+                    <w:tcW w:w="2160" w:type="dxa"/>
+                  </w:tcPr>
+                  <w:sdt>
+                    <w:sdtPr>
+                      <w:alias w:val="#Nav: /ConsSalesInvHeader/ConsSalesInvoiceLine/ChildInvoice_ConsSalesInvoiceLine"/>
+                      <w:tag w:val="#Nav: Cons_invoice_report_SGS/50100"/>
+                      <w:id w:val="187190139"/>
+                      <w:placeholder>
+                        <w:docPart w:val="064912470D48411B917A03DADC9CCDF0"/>
+                      </w:placeholder>
+                      <w15:dataBinding w:prefixMappings="xmlns:ns0='urn:microsoft-dynamics-nav/reports/Cons_invoice_report_SGS/50100/' " w:xpath="/ns0:NavWordReportXmlPart[1]/ns0:ConsSalesInvHeader[1]/ns0:ConsSalesInvoiceLine[1]/ns0:ChildInvoice_ConsSalesInvoiceLine[1]" w:storeItemID="{4DDB2623-6F52-4CC1-8AFA-1F2BE3A6886E}" w16sdtdh:storeItemChecksum="6riOjg=="/>
+                    </w:sdtPr>
+                    <w:sdtEndPr/>
+                    <w:sdtContent>
                       <w:p>
-                        <w:pPr>
-                          <w:jc w:val="center"/>
-                        </w:pPr>
                         <w:proofErr w:type="spellStart"/>
                         <w:r>
                           <w:t>ChildInvoice_ConsSalesInvoiceLine</w:t>
                         </w:r>
                         <w:proofErr w:type="spellEnd"/>
                       </w:p>
-                    </w:tc>
-                  </w:sdtContent>
-                </w:sdt>
-                <w:sdt>
-                  <w:sdtPr>
-                    <w:alias w:val="#Nav: /ConsSalesInvHeader/ConsSalesInvoiceLine/InvoiceAmount_ConsSalesInvoiceLine"/>
-                    <w:tag w:val="#Nav: Cons_invoice_report_SGS/50100"/>
-                    <w:id w:val="-1770931340"/>
-                    <w:placeholder>
-                      <w:docPart w:val="DefaultPlaceholder_-1854013440"/>
-                    </w:placeholder>
-                    <w15:dataBinding w:prefixMappings="xmlns:ns0='urn:microsoft-dynamics-nav/reports/Cons_invoice_report_SGS/50100/' " w:xpath="/ns0:NavWordReportXmlPart[1]/ns0:ConsSalesInvHeader[1]/ns0:ConsSalesInvoiceLine[1]/ns0:InvoiceAmount_ConsSalesInvoiceLine[1]" w:storeItemID="{4DDB2623-6F52-4CC1-8AFA-1F2BE3A6886E}" w16sdtdh:storeItemChecksum="v4mo1w=="/>
-                  </w:sdtPr>
-                  <w:sdtEndPr/>
-                  <w:sdtContent>
-                    <w:tc>
-                      <w:tcPr>
-                        <w:tcW w:w="2250" w:type="dxa"/>
-                      </w:tcPr>
+                    </w:sdtContent>
+                  </w:sdt>
+                  <w:p/>
+                </w:tc>
+                <w:tc>
+                  <w:tcPr>
+                    <w:tcW w:w="2160" w:type="dxa"/>
+                  </w:tcPr>
+                  <w:sdt>
+                    <w:sdtPr>
+                      <w:alias w:val="#Nav: /ConsSalesInvHeader/ConsSalesInvoiceLine/InvoiceAmount_ConsSalesInvoiceLine"/>
+                      <w:tag w:val="#Nav: Cons_invoice_report_SGS/50100"/>
+                      <w:id w:val="-137731653"/>
+                      <w:placeholder>
+                        <w:docPart w:val="064912470D48411B917A03DADC9CCDF0"/>
+                      </w:placeholder>
+                      <w15:dataBinding w:prefixMappings="xmlns:ns0='urn:microsoft-dynamics-nav/reports/Cons_invoice_report_SGS/50100/' " w:xpath="/ns0:NavWordReportXmlPart[1]/ns0:ConsSalesInvHeader[1]/ns0:ConsSalesInvoiceLine[1]/ns0:InvoiceAmount_ConsSalesInvoiceLine[1]" w:storeItemID="{4DDB2623-6F52-4CC1-8AFA-1F2BE3A6886E}" w16sdtdh:storeItemChecksum="6riOjg=="/>
+                    </w:sdtPr>
+                    <w:sdtEndPr/>
+                    <w:sdtContent>
                       <w:p>
-                        <w:pPr>
-                          <w:jc w:val="center"/>
-                        </w:pPr>
                         <w:proofErr w:type="spellStart"/>
                         <w:r>
                           <w:t>InvoiceAmount_ConsSalesInvoiceLine</w:t>
                         </w:r>
                         <w:proofErr w:type="spellEnd"/>
                       </w:p>
-                    </w:tc>
-                  </w:sdtContent>
-                </w:sdt>
-                <w:sdt>
-                  <w:sdtPr>
-                    <w:alias w:val="#Nav: /ConsSalesInvHeader/ConsSalesInvoiceLine/DueDate_ConsSalesInvoiceLine"/>
-                    <w:tag w:val="#Nav: Cons_invoice_report_SGS/50100"/>
-                    <w:id w:val="725871131"/>
-                    <w:placeholder>
-                      <w:docPart w:val="DefaultPlaceholder_-1854013440"/>
-                    </w:placeholder>
-                    <w15:dataBinding w:prefixMappings="xmlns:ns0='urn:microsoft-dynamics-nav/reports/Cons_invoice_report_SGS/50100/' " w:xpath="/ns0:NavWordReportXmlPart[1]/ns0:ConsSalesInvHeader[1]/ns0:ConsSalesInvoiceLine[1]/ns0:DueDate_ConsSalesInvoiceLine[1]" w:storeItemID="{4DDB2623-6F52-4CC1-8AFA-1F2BE3A6886E}" w16sdtdh:storeItemChecksum="v4mo1w=="/>
-                  </w:sdtPr>
-                  <w:sdtEndPr/>
-                  <w:sdtContent>
-                    <w:tc>
-                      <w:tcPr>
-                        <w:tcW w:w="3617" w:type="dxa"/>
-                      </w:tcPr>
+                    </w:sdtContent>
+                  </w:sdt>
+                  <w:p/>
+                </w:tc>
+                <w:tc>
+                  <w:tcPr>
+                    <w:tcW w:w="2160" w:type="dxa"/>
+                  </w:tcPr>
+                  <w:sdt>
+                    <w:sdtPr>
+                      <w:alias w:val="#Nav: /ConsSalesInvHeader/ConsSalesInvoiceLine/PostingDate_ConsSalesInvoiceLine"/>
+                      <w:tag w:val="#Nav: Cons_invoice_report_SGS/50100"/>
+                      <w:id w:val="1145545733"/>
+                      <w:placeholder>
+                        <w:docPart w:val="064912470D48411B917A03DADC9CCDF0"/>
+                      </w:placeholder>
+                      <w15:dataBinding w:prefixMappings="xmlns:ns0='urn:microsoft-dynamics-nav/reports/Cons_invoice_report_SGS/50100/' " w:xpath="/ns0:NavWordReportXmlPart[1]/ns0:ConsSalesInvHeader[1]/ns0:ConsSalesInvoiceLine[1]/ns0:PostingDate_ConsSalesInvoiceLine[1]" w:storeItemID="{4DDB2623-6F52-4CC1-8AFA-1F2BE3A6886E}" w16sdtdh:storeItemChecksum="6riOjg=="/>
+                    </w:sdtPr>
+                    <w:sdtEndPr/>
+                    <w:sdtContent>
                       <w:p>
-                        <w:pPr>
-                          <w:jc w:val="center"/>
-                        </w:pPr>
+                        <w:proofErr w:type="gramStart"/>
+                        <w:r>
+                          <w:t xml:space="preserve">{{ </w:t>
+                        </w:r>
                         <w:proofErr w:type="spellStart"/>
+                        <w:r>
+                          <w:t>PostingDate</w:t>
+                        </w:r>
+                        <w:proofErr w:type="gramEnd"/>
+                        <w:r>
+                          <w:t>_ConsSalesInvoiceLine</w:t>
+                        </w:r>
+                        <w:proofErr w:type="spellEnd"/>
+                        <w:r>
+                          <w:t xml:space="preserve"> \@ MM-dd-</w:t>
+                        </w:r>
+                        <w:proofErr w:type="spellStart"/>
+                        <w:r>
+                          <w:t>yyyy</w:t>
+                        </w:r>
+                        <w:proofErr w:type="spellEnd"/>
+                        <w:r>
+                          <w:t xml:space="preserve"> }}</w:t>
+                        </w:r>
+                      </w:p>
+                    </w:sdtContent>
+                  </w:sdt>
+                  <w:p/>
+                </w:tc>
+                <w:tc>
+                  <w:tcPr>
+                    <w:tcW w:w="2160" w:type="dxa"/>
+                  </w:tcPr>
+                  <w:sdt>
+                    <w:sdtPr>
+                      <w:alias w:val="#Nav: /ConsSalesInvHeader/ConsSalesInvoiceLine/DueDate_ConsSalesInvoiceLine"/>
+                      <w:tag w:val="#Nav: Cons_invoice_report_SGS/50100"/>
+                      <w:id w:val="-1519838079"/>
+                      <w:placeholder>
+                        <w:docPart w:val="064912470D48411B917A03DADC9CCDF0"/>
+                      </w:placeholder>
+                      <w15:dataBinding w:prefixMappings="xmlns:ns0='urn:microsoft-dynamics-nav/reports/Cons_invoice_report_SGS/50100/' " w:xpath="/ns0:NavWordReportXmlPart[1]/ns0:ConsSalesInvHeader[1]/ns0:ConsSalesInvoiceLine[1]/ns0:DueDate_ConsSalesInvoiceLine[1]" w:storeItemID="{4DDB2623-6F52-4CC1-8AFA-1F2BE3A6886E}" w16sdtdh:storeItemChecksum="6riOjg=="/>
+                    </w:sdtPr>
+                    <w:sdtEndPr/>
+                    <w:sdtContent>
+                      <w:p>
                         <w:r>
                           <w:t>DueDate_ConsSalesInvoiceLine</w:t>
                         </w:r>
-                        <w:proofErr w:type="spellEnd"/>
                       </w:p>
-                    </w:tc>
-                  </w:sdtContent>
-                </w:sdt>
+                    </w:sdtContent>
+                  </w:sdt>
+                  <w:p/>
+                </w:tc>
               </w:tr>
             </w:sdtContent>
           </w:sdt>
@@ -1253,7 +1244,7 @@
     </w:docPart>
     <w:docPart>
       <w:docPartPr>
-        <w:name w:val="DefaultPlaceholder_-1854013435"/>
+        <w:name w:val="53E7531E7C084F60B7505CF53CDDF908"/>
         <w:category>
           <w:name w:val="General"/>
           <w:gallery w:val="placeholder"/>
@@ -1264,15 +1255,47 @@
         <w:behaviors>
           <w:behavior w:val="content"/>
         </w:behaviors>
-        <w:guid w:val="{DFCBCC97-F6EE-410C-A1A6-4DEFE54212E3}"/>
+        <w:guid w:val="{56323AFC-8EEC-4970-801D-6FCD463A1BA4}"/>
       </w:docPartPr>
       <w:docPartBody>
         <w:p>
+          <w:pPr>
+            <w:pStyle w:val="53E7531E7C084F60B7505CF53CDDF908"/>
+          </w:pPr>
           <w:r>
             <w:rPr>
               <w:rStyle w:val="PlaceholderText"/>
             </w:rPr>
             <w:t>Enter any content that you want to repeat, including other content controls. You can also insert this control around table rows in order to repeat parts of a table.</w:t>
+          </w:r>
+        </w:p>
+      </w:docPartBody>
+    </w:docPart>
+    <w:docPart>
+      <w:docPartPr>
+        <w:name w:val="064912470D48411B917A03DADC9CCDF0"/>
+        <w:category>
+          <w:name w:val="General"/>
+          <w:gallery w:val="placeholder"/>
+        </w:category>
+        <w:types>
+          <w:type w:val="bbPlcHdr"/>
+        </w:types>
+        <w:behaviors>
+          <w:behavior w:val="content"/>
+        </w:behaviors>
+        <w:guid w:val="{D3623890-0D2F-4FEF-B376-693AADB6B663}"/>
+      </w:docPartPr>
+      <w:docPartBody>
+        <w:p>
+          <w:pPr>
+            <w:pStyle w:val="064912470D48411B917A03DADC9CCDF0"/>
+          </w:pPr>
+          <w:r>
+            <w:rPr>
+              <w:rStyle w:val="PlaceholderText"/>
+            </w:rPr>
+            <w:t>Click or tap here to enter text.</w:t>
           </w:r>
         </w:p>
       </w:docPartBody>
@@ -1292,7 +1315,6 @@
   </w:font>
   <w:font w:name="Yu Mincho">
     <w:altName w:val="游明朝"/>
-    <w:panose1 w:val="02020400000000000000"/>
     <w:charset w:val="80"/>
     <w:family w:val="roman"/>
     <w:pitch w:val="variable"/>
@@ -1344,12 +1366,18 @@
     <w:rsid w:val="001F7E25"/>
     <w:rsid w:val="0026519B"/>
     <w:rsid w:val="004A1F78"/>
+    <w:rsid w:val="004D2E5D"/>
+    <w:rsid w:val="0057548D"/>
     <w:rsid w:val="0062548D"/>
+    <w:rsid w:val="007C2D97"/>
     <w:rsid w:val="009A3460"/>
     <w:rsid w:val="00A57FD9"/>
     <w:rsid w:val="00AC18FD"/>
     <w:rsid w:val="00AD5AAA"/>
+    <w:rsid w:val="00B56C8F"/>
+    <w:rsid w:val="00C72574"/>
     <w:rsid w:val="00DE2B92"/>
+    <w:rsid w:val="00E22AB3"/>
     <w:rsid w:val="00EA5B88"/>
   </w:rsids>
   <m:mathPr>
@@ -1804,10 +1832,18 @@
     <w:basedOn w:val="DefaultParagraphFont"/>
     <w:uiPriority w:val="99"/>
     <w:semiHidden/>
-    <w:rsid w:val="00DE2B92"/>
+    <w:rsid w:val="0057548D"/>
     <w:rPr>
       <w:color w:val="808080"/>
     </w:rPr>
+  </w:style>
+  <w:style w:type="paragraph" w:customStyle="1" w:styleId="53E7531E7C084F60B7505CF53CDDF908">
+    <w:name w:val="53E7531E7C084F60B7505CF53CDDF908"/>
+    <w:rsid w:val="0057548D"/>
+  </w:style>
+  <w:style w:type="paragraph" w:customStyle="1" w:styleId="064912470D48411B917A03DADC9CCDF0">
+    <w:name w:val="064912470D48411B917A03DADC9CCDF0"/>
+    <w:rsid w:val="0057548D"/>
   </w:style>
 </w:styles>
 </file>
@@ -2126,6 +2162,8 @@
  
          < C h i l d I n v o i c e _ C o n s S a l e s I n v o i c e L i n e C a p t i o n > C h i l d I n v o i c e _ C o n s S a l e s I n v o i c e L i n e C a p t i o n < / C h i l d I n v o i c e _ C o n s S a l e s I n v o i c e L i n e C a p t i o n >   
+         < C o n s D a t e _ C o n s S a l e s I n v H e a d e r C a p t i o n > C o n s D a t e _ C o n s S a l e s I n v H e a d e r C a p t i o n < / C o n s D a t e _ C o n s S a l e s I n v H e a d e r C a p t i o n > + 
          < C u s t N o _ C o n s S a l e s I n v H e a d e r C a p t i o n > C u s t N o _ C o n s S a l e s I n v H e a d e r C a p t i o n < / C u s t N o _ C o n s S a l e s I n v H e a d e r C a p t i o n >   
          < D o c u m e n t N o _ C o n s S a l e s I n v o i c e L i n e C a p t i o n > D o c u m e n t N o _ C o n s S a l e s I n v o i c e L i n e C a p t i o n < / D o c u m e n t N o _ C o n s S a l e s I n v o i c e L i n e C a p t i o n > @@ -2134,34 +2172,30 @@
  
          < D u e D a t e _ C o n s S a l e s I n v o i c e L i n e C a p t i o n > D u e D a t e _ C o n s S a l e s I n v o i c e L i n e C a p t i o n < / D u e D a t e _ C o n s S a l e s I n v o i c e L i n e C a p t i o n >   
-         < F r o m D a t e _ C o n s S a l e s I n v H e a d e r C a p t i o n > F r o m D a t e _ C o n s S a l e s I n v H e a d e r C a p t i o n < / F r o m D a t e _ C o n s S a l e s I n v H e a d e r C a p t i o n > - 
          < I n v o i c e A m o u n t _ C o n s S a l e s I n v o i c e L i n e C a p t i o n > I n v o i c e A m o u n t _ C o n s S a l e s I n v o i c e L i n e C a p t i o n < / I n v o i c e A m o u n t _ C o n s S a l e s I n v o i c e L i n e C a p t i o n >   
          < L i n e N o _ C o n s S a l e s I n v o i c e L i n e C a p t i o n > L i n e N o _ C o n s S a l e s I n v o i c e L i n e C a p t i o n < / L i n e N o _ C o n s S a l e s I n v o i c e L i n e C a p t i o n >   
          < N o _ C o n s S a l e s I n v H e a d e r C a p t i o n > N o _ C o n s S a l e s I n v H e a d e r C a p t i o n < / N o _ C o n s S a l e s I n v H e a d e r C a p t i o n >   
+         < P o s t i n g D a t e _ C o n s S a l e s I n v o i c e L i n e C a p t i o n > P o s t i n g D a t e _ C o n s S a l e s I n v o i c e L i n e C a p t i o n < / P o s t i n g D a t e _ C o n s S a l e s I n v o i c e L i n e C a p t i o n > + 
          < S t a t u s _ C o n s S a l e s I n v H e a d e r C a p t i o n > S t a t u s _ C o n s S a l e s I n v H e a d e r C a p t i o n < / S t a t u s _ C o n s S a l e s I n v H e a d e r C a p t i o n >   
-         < T o D a t e _ C o n s S a l e s I n v H e a d e r C a p t i o n > T o D a t e _ C o n s S a l e s I n v H e a d e r C a p t i o n < / T o D a t e _ C o n s S a l e s I n v H e a d e r C a p t i o n > - 
      < / L a b e l s >   
      < C o n s S a l e s I n v H e a d e r >   
+         < C o n s D a t e _ C o n s S a l e s I n v H e a d e r > C o n s D a t e _ C o n s S a l e s I n v H e a d e r < / C o n s D a t e _ C o n s S a l e s I n v H e a d e r > + 
          < C u s t N o _ C o n s S a l e s I n v H e a d e r > C u s t N o _ C o n s S a l e s I n v H e a d e r < / C u s t N o _ C o n s S a l e s I n v H e a d e r >   
          < D u e D a t e _ C o n s S a l e s I n v H e a d e r > D u e D a t e _ C o n s S a l e s I n v H e a d e r < / D u e D a t e _ C o n s S a l e s I n v H e a d e r >   
-         < F r o m D a t e _ C o n s S a l e s I n v H e a d e r > F r o m D a t e _ C o n s S a l e s I n v H e a d e r < / F r o m D a t e _ C o n s S a l e s I n v H e a d e r > - 
          < N o _ C o n s S a l e s I n v H e a d e r > N o _ C o n s S a l e s I n v H e a d e r < / N o _ C o n s S a l e s I n v H e a d e r >   
          < S t a t u s _ C o n s S a l e s I n v H e a d e r > S t a t u s _ C o n s S a l e s I n v H e a d e r < / S t a t u s _ C o n s S a l e s I n v H e a d e r >   
-         < T o D a t e _ C o n s S a l e s I n v H e a d e r > T o D a t e _ C o n s S a l e s I n v H e a d e r < / T o D a t e _ C o n s S a l e s I n v H e a d e r > - 
          < C o n s S a l e s I n v o i c e L i n e >   
              < C h i l d I n v o i c e _ C o n s S a l e s I n v o i c e L i n e > C h i l d I n v o i c e _ C o n s S a l e s I n v o i c e L i n e < / C h i l d I n v o i c e _ C o n s S a l e s I n v o i c e L i n e > @@ -2173,6 +2207,8 @@
              < I n v o i c e A m o u n t _ C o n s S a l e s I n v o i c e L i n e > I n v o i c e A m o u n t _ C o n s S a l e s I n v o i c e L i n e < / I n v o i c e A m o u n t _ C o n s S a l e s I n v o i c e L i n e >   
              < L i n e N o _ C o n s S a l e s I n v o i c e L i n e > L i n e N o _ C o n s S a l e s I n v o i c e L i n e < / L i n e N o _ C o n s S a l e s I n v o i c e L i n e > + 
+             < P o s t i n g D a t e _ C o n s S a l e s I n v o i c e L i n e > P o s t i n g D a t e _ C o n s S a l e s I n v o i c e L i n e < / P o s t i n g D a t e _ C o n s S a l e s I n v o i c e L i n e >   
          < / C o n s S a l e s I n v o i c e L i n e >   

</xml_diff>

<commit_message>
update DueDate Cust. Ledger Entry
</commit_message>
<xml_diff>
--- a/Layout/ConsInvoiceSGSListWord.docx
+++ b/Layout/ConsInvoiceSGSListWord.docx
@@ -2162,23 +2162,15 @@
  
          < C h i l d I n v o i c e _ C o n s S a l e s I n v o i c e L i n e C a p t i o n > C h i l d I n v o i c e _ C o n s S a l e s I n v o i c e L i n e C a p t i o n < / C h i l d I n v o i c e _ C o n s S a l e s I n v o i c e L i n e C a p t i o n >   
-         < C o n s D a t e _ C o n s S a l e s I n v H e a d e r C a p t i o n > C o n s D a t e _ C o n s S a l e s I n v H e a d e r C a p t i o n < / C o n s D a t e _ C o n s S a l e s I n v H e a d e r C a p t i o n > - 
          < C u s t N o _ C o n s S a l e s I n v H e a d e r C a p t i o n > C u s t N o _ C o n s S a l e s I n v H e a d e r C a p t i o n < / C u s t N o _ C o n s S a l e s I n v H e a d e r C a p t i o n >   
          < D o c u m e n t N o _ C o n s S a l e s I n v o i c e L i n e C a p t i o n > D o c u m e n t N o _ C o n s S a l e s I n v o i c e L i n e C a p t i o n < / D o c u m e n t N o _ C o n s S a l e s I n v o i c e L i n e C a p t i o n >   
-         < D u e D a t e _ C o n s S a l e s I n v H e a d e r C a p t i o n > D u e D a t e _ C o n s S a l e s I n v H e a d e r C a p t i o n < / D u e D a t e _ C o n s S a l e s I n v H e a d e r C a p t i o n > - 
-         < D u e D a t e _ C o n s S a l e s I n v o i c e L i n e C a p t i o n > D u e D a t e _ C o n s S a l e s I n v o i c e L i n e C a p t i o n < / D u e D a t e _ C o n s S a l e s I n v o i c e L i n e C a p t i o n > - 
          < I n v o i c e A m o u n t _ C o n s S a l e s I n v o i c e L i n e C a p t i o n > I n v o i c e A m o u n t _ C o n s S a l e s I n v o i c e L i n e C a p t i o n < / I n v o i c e A m o u n t _ C o n s S a l e s I n v o i c e L i n e C a p t i o n >   
          < L i n e N o _ C o n s S a l e s I n v o i c e L i n e C a p t i o n > L i n e N o _ C o n s S a l e s I n v o i c e L i n e C a p t i o n < / L i n e N o _ C o n s S a l e s I n v o i c e L i n e C a p t i o n >   
          < N o _ C o n s S a l e s I n v H e a d e r C a p t i o n > N o _ C o n s S a l e s I n v H e a d e r C a p t i o n < / N o _ C o n s S a l e s I n v H e a d e r C a p t i o n > - 
-         < P o s t i n g D a t e _ C o n s S a l e s I n v o i c e L i n e C a p t i o n > P o s t i n g D a t e _ C o n s S a l e s I n v o i c e L i n e C a p t i o n < / P o s t i n g D a t e _ C o n s S a l e s I n v o i c e L i n e C a p t i o n >   
          < S t a t u s _ C o n s S a l e s I n v H e a d e r C a p t i o n > S t a t u s _ C o n s S a l e s I n v H e a d e r C a p t i o n < / S t a t u s _ C o n s S a l e s I n v H e a d e r C a p t i o n >   

</xml_diff>